<commit_message>
Apellidos del equipo y reparto de responsabilidades entre Isabel Cántaro y Valentine Gaete
Co-Authored-By: Claude Sonnet 5.5 <noreply@anthropic.com>
Claude-Session: https://claude.ai/code/session_01LaPXtaCfna2Tf3AsQieRe8
</commit_message>
<xml_diff>
--- a/docs/ERS_TrazoFino_v2.docx
+++ b/docs/ERS_TrazoFino_v2.docx
@@ -153,7 +153,7 @@
           <w:sz w:val="20"/>
           <w:szCs w:val="20"/>
         </w:rPr>
-        <w:t xml:space="preserve">Equipo: Isabel Cántaro · Valentine [completar apellido]</w:t>
+        <w:t xml:space="preserve">Equipo: Isabel Cántaro · Valentine Gaete</w:t>
       </w:r>
     </w:p>
     <w:p>
@@ -535,7 +535,7 @@
                 <w:sz w:val="19"/>
                 <w:szCs w:val="19"/>
               </w:rPr>
-              <w:t xml:space="preserve">Isabel Cántaro / Valentine [apellido]</w:t>
+              <w:t xml:space="preserve">Isabel Cántaro / Valentine Gaete</w:t>
             </w:r>
           </w:p>
         </w:tc>
@@ -663,7 +663,7 @@
                 <w:sz w:val="19"/>
                 <w:szCs w:val="19"/>
               </w:rPr>
-              <w:t xml:space="preserve">Isabel Cántaro / Valentine [apellido]</w:t>
+              <w:t xml:space="preserve">Isabel Cántaro / Valentine Gaete</w:t>
             </w:r>
           </w:p>
         </w:tc>

</xml_diff>